<commit_message>
Update Lab 5 kit with fuller athletics and customer-service history
Incorporates additional detail from the student: four years of
sports stats/programs/rosters work, hotel front desk experience,
and that the Canva flyer work was done in high school rather than
for a class.

Co-Authored-By: Claude Sonnet 5 <noreply@anthropic.com>
Claude-Session: https://claude.ai/code/session_017aPgBX8bERyZxHUpD5qWXK
</commit_message>
<xml_diff>
--- a/SP304 - Communication & Emerging Technology/career-kit/my-career-kit.docx
+++ b/SP304 - Communication & Emerging Technology/career-kit/my-career-kit.docx
@@ -121,7 +121,7 @@
         <w:t xml:space="preserve">Public / community communication: </w:t>
       </w:r>
       <w:r>
-        <w:t xml:space="preserve">Athletics department at Emporia State (rosters, programs, schedules); front-register work at a grocery store</w:t>
+        <w:t xml:space="preserve">Emporia State Athletics (rosters, programs, schedules); grocery store register; hotel front desk</w:t>
       </w:r>
     </w:p>
     <w:p>
@@ -140,7 +140,7 @@
         <w:t xml:space="preserve">Relationship-building with businesses, schools, community: </w:t>
       </w:r>
       <w:r>
-        <w:t xml:space="preserve">Athletics department role coordinates with coaches, players, and fans</w:t>
+        <w:t xml:space="preserve">Emporia State Athletics role coordinates with coaches, players, and fans</w:t>
       </w:r>
     </w:p>
     <w:p>
@@ -159,7 +159,7 @@
         <w:t xml:space="preserve">In-person / “guerilla” marketing (flyers, signs, events): </w:t>
       </w:r>
       <w:r>
-        <w:t xml:space="preserve">Not yet — weakest match to this posting</w:t>
+        <w:t xml:space="preserve">Designed promotional flyers using Canva in high school</w:t>
       </w:r>
     </w:p>
     <w:p>
@@ -178,7 +178,7 @@
         <w:t xml:space="preserve">Digital marketing &amp; social media: </w:t>
       </w:r>
       <w:r>
-        <w:t xml:space="preserve">Designed social media promotional graphics in Canva for a class project</w:t>
+        <w:t xml:space="preserve">Canva flyer design experience</w:t>
       </w:r>
     </w:p>
     <w:p>
@@ -197,7 +197,7 @@
         <w:t xml:space="preserve">Public interaction &amp; customer service: </w:t>
       </w:r>
       <w:r>
-        <w:t xml:space="preserve">Front-register cash handling at a grocery store</w:t>
+        <w:t xml:space="preserve">Grocery store register and hotel front desk</w:t>
       </w:r>
     </w:p>
     <w:p>
@@ -235,7 +235,7 @@
         <w:t xml:space="preserve">Basic understanding of marketing &amp; promotions: </w:t>
       </w:r>
       <w:r>
-        <w:t xml:space="preserve">Canva social media project for class</w:t>
+        <w:t xml:space="preserve">Canva flyer design in high school</w:t>
       </w:r>
     </w:p>
     <w:p>
@@ -291,31 +291,43 @@
         </w:numPr>
       </w:pPr>
       <w:r>
-        <w:t xml:space="preserve">Recorded and organized game statistics for Emporia State Athletics across multiple sports, supporting accurate record-keeping for coaches and staff.</w:t>
-      </w:r>
-    </w:p>
-    <w:p>
-      <w:pPr>
-        <w:pStyle w:val="ListParagraph"/>
-        <w:numPr>
-          <w:ilvl w:val="0"/>
-          <w:numId w:val="2"/>
-        </w:numPr>
-      </w:pPr>
-      <w:r>
-        <w:t xml:space="preserve">Designed social media promotional graphics in Canva for a class project to advertise an event.</w:t>
-      </w:r>
-    </w:p>
-    <w:p>
-      <w:pPr>
-        <w:pStyle w:val="ListParagraph"/>
-        <w:numPr>
-          <w:ilvl w:val="0"/>
-          <w:numId w:val="2"/>
-        </w:numPr>
-      </w:pPr>
-      <w:r>
-        <w:t xml:space="preserve">Operated the front register at a grocery store, assisting customers and processing transactions during high-volume periods.</w:t>
+        <w:t xml:space="preserve">Recorded and organized game statistics for Emporia State Athletics across multiple sports over four years, supporting accurate record-keeping for coaches and staff.</w:t>
+      </w:r>
+    </w:p>
+    <w:p>
+      <w:pPr>
+        <w:pStyle w:val="ListParagraph"/>
+        <w:numPr>
+          <w:ilvl w:val="0"/>
+          <w:numId w:val="2"/>
+        </w:numPr>
+      </w:pPr>
+      <w:r>
+        <w:t xml:space="preserve">Designed promotional flyers using Canva in high school to advertise events.</w:t>
+      </w:r>
+    </w:p>
+    <w:p>
+      <w:pPr>
+        <w:pStyle w:val="ListParagraph"/>
+        <w:numPr>
+          <w:ilvl w:val="0"/>
+          <w:numId w:val="2"/>
+        </w:numPr>
+      </w:pPr>
+      <w:r>
+        <w:t xml:space="preserve">Operated the front register at a grocery store, assisting customers and processing transactions during busy periods.</w:t>
+      </w:r>
+    </w:p>
+    <w:p>
+      <w:pPr>
+        <w:pStyle w:val="ListParagraph"/>
+        <w:numPr>
+          <w:ilvl w:val="0"/>
+          <w:numId w:val="2"/>
+        </w:numPr>
+      </w:pPr>
+      <w:r>
+        <w:t xml:space="preserve">Assisted guests at a hotel front desk, providing customer service and handling guest needs.</w:t>
       </w:r>
     </w:p>
     <w:p>
@@ -381,7 +393,7 @@
     </w:p>
     <w:p>
       <w:r>
-        <w:t xml:space="preserve">The athletics stats/rosters bullets are the weakest fit — they show organization and reliability, but not direct marketing, social media, or guerilla-marketing experience, which are the core of this specific internship. The Canva bullet and the customer-service bullet map more directly to the posting.</w:t>
+        <w:t xml:space="preserve">The athletics stats bullet is the weakest fit — it shows organization and reliability over a long stretch of time, but not direct marketing, social media, or guerilla-marketing experience, which are the core of this specific internship. The Canva bullet and the two customer-service bullets map more directly to the posting.</w:t>
       </w:r>
     </w:p>
     <w:p>

</xml_diff>